<commit_message>
completed l1 skeleton practise
</commit_message>
<xml_diff>
--- a/skeleton program/1.01.36 Skeleton Program Familiarisation Home.docx
+++ b/skeleton program/1.01.36 Skeleton Program Familiarisation Home.docx
@@ -23,8 +23,6 @@
         </w:rPr>
         <w:t>Familiarisation Homework</w:t>
       </w:r>
-      <w:bookmarkStart w:id="0" w:name="_GoBack"/>
-      <w:bookmarkEnd w:id="0"/>
     </w:p>
     <w:p>
       <w:r>
@@ -139,6 +137,9 @@
       <w:r>
         <w:t>:</w:t>
       </w:r>
+      <w:r>
+        <w:t xml:space="preserve"> none</w:t>
+      </w:r>
     </w:p>
     <w:p>
       <w:r>
@@ -150,6 +151,9 @@
       </w:r>
       <w:r>
         <w:t>:</w:t>
+      </w:r>
+      <w:r>
+        <w:t xml:space="preserve"> none</w:t>
       </w:r>
     </w:p>
     <w:p/>
@@ -388,6 +392,9 @@
             <w:pPr>
               <w:spacing w:before="60" w:after="60"/>
             </w:pPr>
+            <w:r>
+              <w:t>If a new puzzle is created and given multiple arguments, it creates a new puzzle with a list of allowed patterns and a new grid with randomly generated blocked off cells</w:t>
+            </w:r>
           </w:p>
         </w:tc>
       </w:tr>
@@ -451,6 +458,17 @@
             <w:pPr>
               <w:spacing w:before="60" w:after="60"/>
             </w:pPr>
+            <w:r>
+              <w:t xml:space="preserve">Uses </w:t>
+            </w:r>
+            <w:proofErr w:type="spellStart"/>
+            <w:r>
+              <w:t>streamreader</w:t>
+            </w:r>
+            <w:proofErr w:type="spellEnd"/>
+            <w:r>
+              <w:t xml:space="preserve"> with the inputted filename, to process the data from the file, it then reads each line allowing them to be converted into a patter, this is then converted into a grid to be used elsewhere</w:t>
+            </w:r>
           </w:p>
         </w:tc>
       </w:tr>
@@ -514,6 +532,9 @@
             <w:pPr>
               <w:spacing w:before="60" w:after="60"/>
             </w:pPr>
+            <w:r>
+              <w:t>Displays puzzle, while the board is not complete, it outputs the score, and inputs a user row and column, and then places the inputted accepted character to the grid, it then checks if a pattern has been made and adjusts the score accordingly, finally it removes a move from symbols left.</w:t>
+            </w:r>
           </w:p>
         </w:tc>
       </w:tr>
@@ -577,6 +598,9 @@
             <w:pPr>
               <w:spacing w:before="60" w:after="60"/>
             </w:pPr>
+            <w:r>
+              <w:t>Returns the cell specified by the inputted row and column</w:t>
+            </w:r>
           </w:p>
         </w:tc>
       </w:tr>
@@ -640,6 +664,17 @@
             <w:pPr>
               <w:spacing w:before="60" w:after="60"/>
             </w:pPr>
+            <w:r>
+              <w:t xml:space="preserve">Using loops, this scours every possible 3x3 grid combination, searching for allowed patterns that are </w:t>
+            </w:r>
+            <w:proofErr w:type="spellStart"/>
+            <w:r>
+              <w:t>unyet</w:t>
+            </w:r>
+            <w:proofErr w:type="spellEnd"/>
+            <w:r>
+              <w:t xml:space="preserve"> found of the current symbol. Returning 10 if found and 0 if not</w:t>
+            </w:r>
           </w:p>
         </w:tc>
       </w:tr>
@@ -703,6 +738,9 @@
             <w:pPr>
               <w:spacing w:before="60" w:after="60"/>
             </w:pPr>
+            <w:r>
+              <w:t>Ensures the user enters a correct allowed symbol using while loops and returns said allowed symbol</w:t>
+            </w:r>
           </w:p>
         </w:tc>
       </w:tr>
@@ -766,6 +804,12 @@
             <w:pPr>
               <w:spacing w:before="60" w:after="60"/>
             </w:pPr>
+            <w:r>
+              <w:t xml:space="preserve">Creates a display </w:t>
+            </w:r>
+            <w:r>
+              <w:t>line for the 2d grid for the console window</w:t>
+            </w:r>
           </w:p>
         </w:tc>
       </w:tr>
@@ -786,6 +830,7 @@
               <w:rPr>
                 <w:rFonts w:ascii="Consolas" w:hAnsi="Consolas" w:cs="Courier New"/>
               </w:rPr>
+              <w:lastRenderedPageBreak/>
               <w:t>DisplayPuzzle</w:t>
             </w:r>
             <w:proofErr w:type="spellEnd"/>
@@ -829,6 +874,17 @@
             <w:pPr>
               <w:spacing w:before="60" w:after="60"/>
             </w:pPr>
+            <w:r>
+              <w:t xml:space="preserve">Outputs the generated display line in the correct formatting using a variety of methods such as the use of the </w:t>
+            </w:r>
+            <w:proofErr w:type="spellStart"/>
+            <w:r>
+              <w:t>modulous</w:t>
+            </w:r>
+            <w:proofErr w:type="spellEnd"/>
+            <w:r>
+              <w:t xml:space="preserve"> operator</w:t>
+            </w:r>
           </w:p>
         </w:tc>
       </w:tr>
@@ -864,23 +920,33 @@
           <w:b/>
           <w:color w:val="0070C0"/>
         </w:rPr>
-        <w:t>Private variables</w:t>
-      </w:r>
-      <w:r>
-        <w:t>:</w:t>
-      </w:r>
-    </w:p>
-    <w:p>
+        <w:t xml:space="preserve">Private </w:t>
+      </w:r>
+      <w:proofErr w:type="spellStart"/>
+      <w:proofErr w:type="gramStart"/>
       <w:r>
         <w:rPr>
           <w:b/>
           <w:color w:val="0070C0"/>
         </w:rPr>
-        <w:t>Protected variables</w:t>
+        <w:t>variables</w:t>
       </w:r>
       <w:r>
         <w:t>:</w:t>
       </w:r>
+      <w:r>
+        <w:t>symbol</w:t>
+      </w:r>
+      <w:proofErr w:type="spellEnd"/>
+      <w:proofErr w:type="gramEnd"/>
+      <w:r>
+        <w:t xml:space="preserve">, </w:t>
+      </w:r>
+      <w:proofErr w:type="spellStart"/>
+      <w:r>
+        <w:t>PatternSequence</w:t>
+      </w:r>
+      <w:proofErr w:type="spellEnd"/>
     </w:p>
     <w:p>
       <w:r>
@@ -888,11 +954,51 @@
           <w:b/>
           <w:color w:val="0070C0"/>
         </w:rPr>
-        <w:t>Public variables</w:t>
+        <w:t xml:space="preserve">Protected </w:t>
+      </w:r>
+      <w:proofErr w:type="spellStart"/>
+      <w:proofErr w:type="gramStart"/>
+      <w:r>
+        <w:rPr>
+          <w:b/>
+          <w:color w:val="0070C0"/>
+        </w:rPr>
+        <w:t>variables</w:t>
       </w:r>
       <w:r>
         <w:t>:</w:t>
       </w:r>
+      <w:r>
+        <w:t>none</w:t>
+      </w:r>
+      <w:proofErr w:type="spellEnd"/>
+      <w:proofErr w:type="gramEnd"/>
+    </w:p>
+    <w:p>
+      <w:r>
+        <w:rPr>
+          <w:b/>
+          <w:color w:val="0070C0"/>
+        </w:rPr>
+        <w:t xml:space="preserve">Public </w:t>
+      </w:r>
+      <w:proofErr w:type="spellStart"/>
+      <w:proofErr w:type="gramStart"/>
+      <w:r>
+        <w:rPr>
+          <w:b/>
+          <w:color w:val="0070C0"/>
+        </w:rPr>
+        <w:t>variables</w:t>
+      </w:r>
+      <w:r>
+        <w:t>:</w:t>
+      </w:r>
+      <w:r>
+        <w:t>none</w:t>
+      </w:r>
+      <w:proofErr w:type="spellEnd"/>
+      <w:proofErr w:type="gramEnd"/>
     </w:p>
     <w:p/>
     <w:p>
@@ -1023,6 +1129,22 @@
             <w:pPr>
               <w:spacing w:before="60" w:after="60"/>
             </w:pPr>
+            <w:r>
+              <w:t xml:space="preserve">Sets symbol to be inputted symbol and </w:t>
+            </w:r>
+            <w:proofErr w:type="spellStart"/>
+            <w:r>
+              <w:t>patternsequence</w:t>
+            </w:r>
+            <w:proofErr w:type="spellEnd"/>
+            <w:r>
+              <w:t xml:space="preserve"> to be inputted </w:t>
+            </w:r>
+            <w:proofErr w:type="spellStart"/>
+            <w:r>
+              <w:t>patternsequence</w:t>
+            </w:r>
+            <w:proofErr w:type="spellEnd"/>
           </w:p>
         </w:tc>
       </w:tr>
@@ -1089,6 +1211,14 @@
             <w:r>
               <w:t>(Overridable)</w:t>
             </w:r>
+            <w:r>
+              <w:t xml:space="preserve"> checks if there is a matched pattern using the </w:t>
+            </w:r>
+            <w:proofErr w:type="spellStart"/>
+            <w:r>
+              <w:t>patternsequence</w:t>
+            </w:r>
+            <w:proofErr w:type="spellEnd"/>
           </w:p>
         </w:tc>
       </w:tr>
@@ -1155,6 +1285,14 @@
             <w:r>
               <w:t>(Overridable)</w:t>
             </w:r>
+            <w:r>
+              <w:t xml:space="preserve"> is the getter for the </w:t>
+            </w:r>
+            <w:proofErr w:type="spellStart"/>
+            <w:r>
+              <w:t>patternSequence</w:t>
+            </w:r>
+            <w:proofErr w:type="spellEnd"/>
           </w:p>
         </w:tc>
       </w:tr>
@@ -1164,6 +1302,8 @@
       <w:r>
         <w:br w:type="page"/>
       </w:r>
+      <w:bookmarkStart w:id="0" w:name="_GoBack"/>
+      <w:bookmarkEnd w:id="0"/>
     </w:p>
     <w:p>
       <w:pPr>
@@ -1195,6 +1335,14 @@
       <w:r>
         <w:t>:</w:t>
       </w:r>
+      <w:r>
+        <w:t xml:space="preserve"> </w:t>
+      </w:r>
+      <w:proofErr w:type="spellStart"/>
+      <w:r>
+        <w:t>SymbolsNotAllowed</w:t>
+      </w:r>
+      <w:proofErr w:type="spellEnd"/>
     </w:p>
     <w:p>
       <w:r>
@@ -1207,6 +1355,9 @@
       <w:r>
         <w:t>:</w:t>
       </w:r>
+      <w:r>
+        <w:t xml:space="preserve"> symbol</w:t>
+      </w:r>
     </w:p>
     <w:p>
       <w:r>
@@ -1218,6 +1369,9 @@
       </w:r>
       <w:r>
         <w:t>:</w:t>
+      </w:r>
+      <w:r>
+        <w:t xml:space="preserve"> none</w:t>
       </w:r>
     </w:p>
     <w:p/>
@@ -1349,6 +1503,17 @@
             <w:pPr>
               <w:spacing w:before="60" w:after="60"/>
             </w:pPr>
+            <w:r>
+              <w:t xml:space="preserve">Sets symbol to be a blank string and </w:t>
+            </w:r>
+            <w:proofErr w:type="spellStart"/>
+            <w:r>
+              <w:t>symbolsNotAllowed</w:t>
+            </w:r>
+            <w:proofErr w:type="spellEnd"/>
+            <w:r>
+              <w:t xml:space="preserve"> to be a new list of string</w:t>
+            </w:r>
           </w:p>
         </w:tc>
       </w:tr>
@@ -1419,6 +1584,17 @@
             <w:r>
               <w:t>(Overridable)</w:t>
             </w:r>
+            <w:r>
+              <w:t xml:space="preserve"> getter for symbol, returns “</w:t>
+            </w:r>
+            <w:proofErr w:type="gramStart"/>
+            <w:r>
+              <w:t>-“</w:t>
+            </w:r>
+            <w:proofErr w:type="gramEnd"/>
+            <w:r>
+              <w:t>if symbol is a blank string</w:t>
+            </w:r>
           </w:p>
         </w:tc>
       </w:tr>
@@ -1486,6 +1662,9 @@
             <w:pPr>
               <w:spacing w:before="60" w:after="60"/>
             </w:pPr>
+            <w:r>
+              <w:t>Returns true if symbol is a blank string</w:t>
+            </w:r>
           </w:p>
         </w:tc>
       </w:tr>
@@ -1543,6 +1722,9 @@
             <w:pPr>
               <w:spacing w:before="60" w:after="60"/>
             </w:pPr>
+            <w:r>
+              <w:t>Setter to modify symbol</w:t>
+            </w:r>
           </w:p>
         </w:tc>
       </w:tr>
@@ -1609,6 +1791,17 @@
             <w:r>
               <w:t>(Overridable)</w:t>
             </w:r>
+            <w:r>
+              <w:t xml:space="preserve"> checks if the symbol is not in the </w:t>
+            </w:r>
+            <w:proofErr w:type="spellStart"/>
+            <w:r>
+              <w:t>SymbolsNotAllowed</w:t>
+            </w:r>
+            <w:proofErr w:type="spellEnd"/>
+            <w:r>
+              <w:t xml:space="preserve"> list, returning true if they are not.</w:t>
+            </w:r>
           </w:p>
         </w:tc>
       </w:tr>
@@ -1669,6 +1862,17 @@
             <w:r>
               <w:t>(Overridable)</w:t>
             </w:r>
+            <w:r>
+              <w:t xml:space="preserve"> adds an inputted symbol to the </w:t>
+            </w:r>
+            <w:proofErr w:type="spellStart"/>
+            <w:r>
+              <w:t>SymbolsNotAllowed</w:t>
+            </w:r>
+            <w:proofErr w:type="spellEnd"/>
+            <w:r>
+              <w:t xml:space="preserve"> list</w:t>
+            </w:r>
           </w:p>
         </w:tc>
       </w:tr>
@@ -1728,6 +1932,9 @@
             </w:pPr>
             <w:r>
               <w:t>(Overridable)</w:t>
+            </w:r>
+            <w:r>
+              <w:t xml:space="preserve"> is an empty sub for classes to inherit and override</w:t>
             </w:r>
           </w:p>
         </w:tc>
@@ -1777,11 +1984,25 @@
           <w:b/>
           <w:color w:val="0070C0"/>
         </w:rPr>
-        <w:t>Private variables</w:t>
+        <w:t xml:space="preserve">Private </w:t>
+      </w:r>
+      <w:proofErr w:type="spellStart"/>
+      <w:proofErr w:type="gramStart"/>
+      <w:r>
+        <w:rPr>
+          <w:b/>
+          <w:color w:val="0070C0"/>
+        </w:rPr>
+        <w:t>variables</w:t>
       </w:r>
       <w:r>
         <w:t>:</w:t>
       </w:r>
+      <w:r>
+        <w:t>none</w:t>
+      </w:r>
+      <w:proofErr w:type="spellEnd"/>
+      <w:proofErr w:type="gramEnd"/>
     </w:p>
     <w:p>
       <w:r>
@@ -1794,6 +2015,9 @@
       <w:r>
         <w:t>:</w:t>
       </w:r>
+      <w:r>
+        <w:t xml:space="preserve"> symbol</w:t>
+      </w:r>
     </w:p>
     <w:p>
       <w:r>
@@ -1801,11 +2025,25 @@
           <w:b/>
           <w:color w:val="0070C0"/>
         </w:rPr>
-        <w:t>Public variables</w:t>
+        <w:t xml:space="preserve">Public </w:t>
+      </w:r>
+      <w:proofErr w:type="spellStart"/>
+      <w:proofErr w:type="gramStart"/>
+      <w:r>
+        <w:rPr>
+          <w:b/>
+          <w:color w:val="0070C0"/>
+        </w:rPr>
+        <w:t>variables</w:t>
       </w:r>
       <w:r>
         <w:t>:</w:t>
       </w:r>
+      <w:r>
+        <w:t>none</w:t>
+      </w:r>
+      <w:proofErr w:type="spellEnd"/>
+      <w:proofErr w:type="gramEnd"/>
     </w:p>
     <w:p/>
     <w:p>
@@ -1936,6 +2174,30 @@
             <w:pPr>
               <w:spacing w:before="60" w:after="60"/>
             </w:pPr>
+            <w:r>
+              <w:t xml:space="preserve">Inherits all functionality by calling </w:t>
+            </w:r>
+            <w:proofErr w:type="spellStart"/>
+            <w:proofErr w:type="gramStart"/>
+            <w:r>
+              <w:t>mybase.new</w:t>
+            </w:r>
+            <w:proofErr w:type="spellEnd"/>
+            <w:r>
+              <w:t>(</w:t>
+            </w:r>
+            <w:proofErr w:type="gramEnd"/>
+            <w:r>
+              <w:t>)</w:t>
+            </w:r>
+          </w:p>
+          <w:p>
+            <w:pPr>
+              <w:spacing w:before="60" w:after="60"/>
+            </w:pPr>
+            <w:r>
+              <w:t>Sets symbol to be the blocked character “@”</w:t>
+            </w:r>
           </w:p>
         </w:tc>
       </w:tr>
@@ -1999,6 +2261,9 @@
             <w:pPr>
               <w:spacing w:before="60" w:after="60"/>
             </w:pPr>
+            <w:r>
+              <w:t>Makes the symbol never allowed as this is not an empty space and is blocked off to the user making sure they cannot change it by overriding the function from the parent class.</w:t>
+            </w:r>
           </w:p>
         </w:tc>
       </w:tr>
@@ -3068,6 +3333,27 @@
 </file>
 
 <file path=customXml/item1.xml><?xml version="1.0" encoding="utf-8"?>
+<p:properties xmlns:p="http://schemas.microsoft.com/office/2006/metadata/properties" xmlns:xsi="http://www.w3.org/2001/XMLSchema-instance" xmlns:pc="http://schemas.microsoft.com/office/infopath/2007/PartnerControls">
+  <documentManagement>
+    <TaxCatchAll xmlns="96751d7e-a200-40d1-aa8a-d3b3a2b74264" xsi:nil="true"/>
+    <lcf76f155ced4ddcb4097134ff3c332f xmlns="0a66d88d-c6e6-44f2-9806-6460aa594fa3">
+      <Terms xmlns="http://schemas.microsoft.com/office/infopath/2007/PartnerControls"/>
+    </lcf76f155ced4ddcb4097134ff3c332f>
+    <ReferenceId xmlns="0a66d88d-c6e6-44f2-9806-6460aa594fa3" xsi:nil="true"/>
+  </documentManagement>
+</p:properties>
+</file>
+
+<file path=customXml/item2.xml><?xml version="1.0" encoding="utf-8"?>
+<?mso-contentType ?>
+<FormTemplates xmlns="http://schemas.microsoft.com/sharepoint/v3/contenttype/forms">
+  <Display>DocumentLibraryForm</Display>
+  <Edit>DocumentLibraryForm</Edit>
+  <New>DocumentLibraryForm</New>
+</FormTemplates>
+</file>
+
+<file path=customXml/item3.xml><?xml version="1.0" encoding="utf-8"?>
 <ct:contentTypeSchema xmlns:ct="http://schemas.microsoft.com/office/2006/metadata/contentType" xmlns:ma="http://schemas.microsoft.com/office/2006/metadata/properties/metaAttributes" ct:_="" ma:_="" ma:contentTypeName="Document" ma:contentTypeID="0x0101002E64BCF65986A543899EC38283AF602F" ma:contentTypeVersion="11" ma:contentTypeDescription="Create a new document." ma:contentTypeScope="" ma:versionID="a0cf22056ce609b440439a65dd27b4ca">
   <xsd:schema xmlns:xsd="http://www.w3.org/2001/XMLSchema" xmlns:xs="http://www.w3.org/2001/XMLSchema" xmlns:p="http://schemas.microsoft.com/office/2006/metadata/properties" xmlns:ns2="0a66d88d-c6e6-44f2-9806-6460aa594fa3" xmlns:ns3="96751d7e-a200-40d1-aa8a-d3b3a2b74264" targetNamespace="http://schemas.microsoft.com/office/2006/metadata/properties" ma:root="true" ma:fieldsID="b0006f4af16beecffdd587bf5204557f" ns2:_="" ns3:_="">
     <xsd:import namespace="0a66d88d-c6e6-44f2-9806-6460aa594fa3"/>
@@ -3262,35 +3548,40 @@
 </ct:contentTypeSchema>
 </file>
 
-<file path=customXml/item2.xml><?xml version="1.0" encoding="utf-8"?>
-<?mso-contentType ?>
-<FormTemplates xmlns="http://schemas.microsoft.com/sharepoint/v3/contenttype/forms">
-  <Display>DocumentLibraryForm</Display>
-  <Edit>DocumentLibraryForm</Edit>
-  <New>DocumentLibraryForm</New>
-</FormTemplates>
-</file>
-
-<file path=customXml/item3.xml><?xml version="1.0" encoding="utf-8"?>
-<p:properties xmlns:p="http://schemas.microsoft.com/office/2006/metadata/properties" xmlns:xsi="http://www.w3.org/2001/XMLSchema-instance" xmlns:pc="http://schemas.microsoft.com/office/infopath/2007/PartnerControls">
-  <documentManagement>
-    <TaxCatchAll xmlns="96751d7e-a200-40d1-aa8a-d3b3a2b74264" xsi:nil="true"/>
-    <lcf76f155ced4ddcb4097134ff3c332f xmlns="0a66d88d-c6e6-44f2-9806-6460aa594fa3">
-      <Terms xmlns="http://schemas.microsoft.com/office/infopath/2007/PartnerControls"/>
-    </lcf76f155ced4ddcb4097134ff3c332f>
-    <ReferenceId xmlns="0a66d88d-c6e6-44f2-9806-6460aa594fa3" xsi:nil="true"/>
-  </documentManagement>
-</p:properties>
-</file>
-
 <file path=customXml/itemProps1.xml><?xml version="1.0" encoding="utf-8"?>
-<ds:datastoreItem xmlns:ds="http://schemas.openxmlformats.org/officeDocument/2006/customXml" ds:itemID="{55A9E31F-0A09-4C65-BC92-B27CB17CFECD}"/>
+<ds:datastoreItem xmlns:ds="http://schemas.openxmlformats.org/officeDocument/2006/customXml" ds:itemID="{F4679D03-7644-4900-B3B7-E69CEEF714A1}">
+  <ds:schemaRefs>
+    <ds:schemaRef ds:uri="http://schemas.microsoft.com/office/2006/metadata/properties"/>
+    <ds:schemaRef ds:uri="http://schemas.microsoft.com/office/infopath/2007/PartnerControls"/>
+    <ds:schemaRef ds:uri="96751d7e-a200-40d1-aa8a-d3b3a2b74264"/>
+    <ds:schemaRef ds:uri="0a66d88d-c6e6-44f2-9806-6460aa594fa3"/>
+  </ds:schemaRefs>
+</ds:datastoreItem>
 </file>
 
 <file path=customXml/itemProps2.xml><?xml version="1.0" encoding="utf-8"?>
-<ds:datastoreItem xmlns:ds="http://schemas.openxmlformats.org/officeDocument/2006/customXml" ds:itemID="{800A181F-0C45-4BEF-8873-CA81EF655C2E}"/>
+<ds:datastoreItem xmlns:ds="http://schemas.openxmlformats.org/officeDocument/2006/customXml" ds:itemID="{800A181F-0C45-4BEF-8873-CA81EF655C2E}">
+  <ds:schemaRefs>
+    <ds:schemaRef ds:uri="http://schemas.microsoft.com/sharepoint/v3/contenttype/forms"/>
+  </ds:schemaRefs>
+</ds:datastoreItem>
 </file>
 
 <file path=customXml/itemProps3.xml><?xml version="1.0" encoding="utf-8"?>
-<ds:datastoreItem xmlns:ds="http://schemas.openxmlformats.org/officeDocument/2006/customXml" ds:itemID="{F4679D03-7644-4900-B3B7-E69CEEF714A1}"/>
+<ds:datastoreItem xmlns:ds="http://schemas.openxmlformats.org/officeDocument/2006/customXml" ds:itemID="{55A9E31F-0A09-4C65-BC92-B27CB17CFECD}">
+  <ds:schemaRefs>
+    <ds:schemaRef ds:uri="http://schemas.microsoft.com/office/2006/metadata/contentType"/>
+    <ds:schemaRef ds:uri="http://schemas.microsoft.com/office/2006/metadata/properties/metaAttributes"/>
+    <ds:schemaRef ds:uri="http://www.w3.org/2001/XMLSchema"/>
+    <ds:schemaRef ds:uri="http://schemas.microsoft.com/office/2006/metadata/properties"/>
+    <ds:schemaRef ds:uri="0a66d88d-c6e6-44f2-9806-6460aa594fa3"/>
+    <ds:schemaRef ds:uri="96751d7e-a200-40d1-aa8a-d3b3a2b74264"/>
+    <ds:schemaRef ds:uri="http://schemas.microsoft.com/office/2006/documentManagement/types"/>
+    <ds:schemaRef ds:uri="http://schemas.microsoft.com/office/infopath/2007/PartnerControls"/>
+    <ds:schemaRef ds:uri="http://schemas.openxmlformats.org/package/2006/metadata/core-properties"/>
+    <ds:schemaRef ds:uri="http://purl.org/dc/elements/1.1/"/>
+    <ds:schemaRef ds:uri="http://purl.org/dc/terms/"/>
+    <ds:schemaRef ds:uri="http://schemas.microsoft.com/internal/obd"/>
+  </ds:schemaRefs>
+</ds:datastoreItem>
 </file>
</xml_diff>